<commit_message>
Actualiza el informe PDF con las figuras y tablas del Colab ejecutado.
Las cuatro gráficas del notebook (mapas TF-IDF/LSA y PCA) quedan embebidas y alineadas con las métricas de la corrida.

Co-authored-by: Cursor <cursoragent@cursor.com>
</commit_message>
<xml_diff>
--- a/REA1_Embeddings/Informe_Transforma_Texto_Embeddings_Wilson_Diaz.docx
+++ b/REA1_Embeddings/Informe_Transforma_Texto_Embeddings_Wilson_Diaz.docx
@@ -279,7 +279,7 @@
         <w:jc w:val="both"/>
       </w:pPr>
       <w:r>
-        <w:t>Repositorio GitHub (público): https://github.com/SonicWD/PROCESAMIENTO-DE-LENGUAJE-NATURAL. Notebook del laboratorio (Colab): https://colab.research.google.com/github/SonicWD/PROCESAMIENTO-DE-LENGUAJE-NATURAL/blob/main/REA1_Embeddings/Laboratorio_Transforma_Texto_Embeddings.ipynb. El PDF se basa en la ejecución de ese cuaderno y del script laboratorio.py, con las mismas ocho oraciones, semilla 42 y figuras reproducibles.</w:t>
+        <w:t>Repositorio GitHub (público): https://github.com/SonicWD/PROCESAMIENTO-DE-LENGUAJE-NATURAL. Notebook del laboratorio, ya ejecutado en Google Colab con salidas y figuras: https://colab.research.google.com/github/SonicWD/PROCESAMIENTO-DE-LENGUAJE-NATURAL/blob/main/REA1_Embeddings/Laboratorio_Transforma_Texto_Embeddings.ipynb. Las imágenes de este informe se extraen de esas celdas (mapas de calor y PCA). La semilla es 42; el corpus son las ocho oraciones del cuaderno.</w:t>
       </w:r>
     </w:p>
     <w:p>
@@ -367,7 +367,7 @@
           <w:b/>
           <w:sz w:val="24"/>
         </w:rPr>
-        <w:t>4. Resultados</w:t>
+        <w:t>4. Resultados (salida de Colab)</w:t>
       </w:r>
     </w:p>
     <w:p>
@@ -377,7 +377,389 @@
         <w:jc w:val="both"/>
       </w:pPr>
       <w:r>
-        <w:t>La Tabla implícita en las métricas muestra el salto cualitativo al densificar. One-hot: intra 0.346 vs inter 0.0053. TF-IDF: intra 0.2363 vs inter 0.0045. LSA (3D): intra 0.9879 vs inter 0.0155. PPMI+SVD (3D): intra 0.9872 vs inter 0.0351. En las representaciones dispersas ya hay señal —los temas no son ruido—, pero el margen es moderado porque dos avisos de vivienda no copian las mismas palabras (D4 vs D5 en TF-IDF = 0.3988; D4 vs D7 deporte = 0.0). Al bajar a tres dimensiones, el coseno intra-tema se acerca a 1 y el inter-tema permanece cerca de 0. LSA no “inventa” temas: comprime las correlaciones que ya estaban en TF-IDF y las vuelve geometría. La varianza por componente fue [0.1317, 0.1303, 0.163] (la suma es parcial: tres ejes no reconstruyen las 57 dimensiones, y no hace falta para separar tres tópicos).</w:t>
+        <w:t>La Tabla 1 copia la celda 7 del notebook. Al pasar de 57 dimensiones dispersas a 3 densas, el coseno intra-tema pasa de 0.24–0.35 a ≈ 0.99, y el inter-tema sigue cerca de 0. En TF-IDF, D4 y D5 (vivienda) se parecen 0.40 y D4 vs D7 (deporte) queda en 0.00: sin palabras compartidas no hay señal. LSA no inventa temas; comprime las correlaciones de TF-IDF. La varianza de los tres componentes LSA es 0.1317, 0.1303 y 0.1630 (suma 0.425): basta para separar tres tópicos, no para reconstruir el vocabulario completo.</w:t>
+      </w:r>
+    </w:p>
+    <w:tbl>
+      <w:tblPr>
+        <w:tblStyle w:val="TableGrid"/>
+        <w:tblW w:type="auto" w:w="0"/>
+        <w:jc w:val="center"/>
+        <w:tblLook w:firstColumn="1" w:firstRow="1" w:lastColumn="0" w:lastRow="0" w:noHBand="0" w:noVBand="1" w:val="04A0"/>
+      </w:tblPr>
+      <w:tblGrid>
+        <w:gridCol w:w="2340"/>
+        <w:gridCol w:w="2340"/>
+        <w:gridCol w:w="2340"/>
+        <w:gridCol w:w="2340"/>
+      </w:tblGrid>
+      <w:tr>
+        <w:tc>
+          <w:tcPr>
+            <w:tcW w:type="dxa" w:w="2340"/>
+          </w:tcPr>
+          <w:p>
+            <w:pPr>
+              <w:jc w:val="center"/>
+            </w:pPr>
+            <w:r>
+              <w:rPr>
+                <w:rFonts w:ascii="Times New Roman" w:hAnsi="Times New Roman"/>
+                <w:b/>
+                <w:sz w:val="20"/>
+              </w:rPr>
+              <w:t>Representación</w:t>
+            </w:r>
+          </w:p>
+        </w:tc>
+        <w:tc>
+          <w:tcPr>
+            <w:tcW w:type="dxa" w:w="2340"/>
+          </w:tcPr>
+          <w:p>
+            <w:pPr>
+              <w:jc w:val="center"/>
+            </w:pPr>
+            <w:r>
+              <w:rPr>
+                <w:rFonts w:ascii="Times New Roman" w:hAnsi="Times New Roman"/>
+                <w:b/>
+                <w:sz w:val="20"/>
+              </w:rPr>
+              <w:t>Dim.</w:t>
+            </w:r>
+          </w:p>
+        </w:tc>
+        <w:tc>
+          <w:tcPr>
+            <w:tcW w:type="dxa" w:w="2340"/>
+          </w:tcPr>
+          <w:p>
+            <w:pPr>
+              <w:jc w:val="center"/>
+            </w:pPr>
+            <w:r>
+              <w:rPr>
+                <w:rFonts w:ascii="Times New Roman" w:hAnsi="Times New Roman"/>
+                <w:b/>
+                <w:sz w:val="20"/>
+              </w:rPr>
+              <w:t>Coseno intra-tema</w:t>
+            </w:r>
+          </w:p>
+        </w:tc>
+        <w:tc>
+          <w:tcPr>
+            <w:tcW w:type="dxa" w:w="2340"/>
+          </w:tcPr>
+          <w:p>
+            <w:pPr>
+              <w:jc w:val="center"/>
+            </w:pPr>
+            <w:r>
+              <w:rPr>
+                <w:rFonts w:ascii="Times New Roman" w:hAnsi="Times New Roman"/>
+                <w:b/>
+                <w:sz w:val="20"/>
+              </w:rPr>
+              <w:t>Coseno inter-tema</w:t>
+            </w:r>
+          </w:p>
+        </w:tc>
+      </w:tr>
+      <w:tr>
+        <w:tc>
+          <w:tcPr>
+            <w:tcW w:type="dxa" w:w="2340"/>
+          </w:tcPr>
+          <w:p>
+            <w:pPr>
+              <w:jc w:val="center"/>
+            </w:pPr>
+            <w:r>
+              <w:rPr>
+                <w:rFonts w:ascii="Times New Roman" w:hAnsi="Times New Roman"/>
+                <w:sz w:val="20"/>
+              </w:rPr>
+              <w:t>one-hot</w:t>
+            </w:r>
+          </w:p>
+        </w:tc>
+        <w:tc>
+          <w:tcPr>
+            <w:tcW w:type="dxa" w:w="2340"/>
+          </w:tcPr>
+          <w:p>
+            <w:pPr>
+              <w:jc w:val="center"/>
+            </w:pPr>
+            <w:r>
+              <w:rPr>
+                <w:rFonts w:ascii="Times New Roman" w:hAnsi="Times New Roman"/>
+                <w:sz w:val="20"/>
+              </w:rPr>
+              <w:t>57</w:t>
+            </w:r>
+          </w:p>
+        </w:tc>
+        <w:tc>
+          <w:tcPr>
+            <w:tcW w:type="dxa" w:w="2340"/>
+          </w:tcPr>
+          <w:p>
+            <w:pPr>
+              <w:jc w:val="center"/>
+            </w:pPr>
+            <w:r>
+              <w:rPr>
+                <w:rFonts w:ascii="Times New Roman" w:hAnsi="Times New Roman"/>
+                <w:sz w:val="20"/>
+              </w:rPr>
+              <w:t>0.3460</w:t>
+            </w:r>
+          </w:p>
+        </w:tc>
+        <w:tc>
+          <w:tcPr>
+            <w:tcW w:type="dxa" w:w="2340"/>
+          </w:tcPr>
+          <w:p>
+            <w:pPr>
+              <w:jc w:val="center"/>
+            </w:pPr>
+            <w:r>
+              <w:rPr>
+                <w:rFonts w:ascii="Times New Roman" w:hAnsi="Times New Roman"/>
+                <w:sz w:val="20"/>
+              </w:rPr>
+              <w:t>0.0053</w:t>
+            </w:r>
+          </w:p>
+        </w:tc>
+      </w:tr>
+      <w:tr>
+        <w:tc>
+          <w:tcPr>
+            <w:tcW w:type="dxa" w:w="2340"/>
+          </w:tcPr>
+          <w:p>
+            <w:pPr>
+              <w:jc w:val="center"/>
+            </w:pPr>
+            <w:r>
+              <w:rPr>
+                <w:rFonts w:ascii="Times New Roman" w:hAnsi="Times New Roman"/>
+                <w:sz w:val="20"/>
+              </w:rPr>
+              <w:t>TF-IDF</w:t>
+            </w:r>
+          </w:p>
+        </w:tc>
+        <w:tc>
+          <w:tcPr>
+            <w:tcW w:type="dxa" w:w="2340"/>
+          </w:tcPr>
+          <w:p>
+            <w:pPr>
+              <w:jc w:val="center"/>
+            </w:pPr>
+            <w:r>
+              <w:rPr>
+                <w:rFonts w:ascii="Times New Roman" w:hAnsi="Times New Roman"/>
+                <w:sz w:val="20"/>
+              </w:rPr>
+              <w:t>57</w:t>
+            </w:r>
+          </w:p>
+        </w:tc>
+        <w:tc>
+          <w:tcPr>
+            <w:tcW w:type="dxa" w:w="2340"/>
+          </w:tcPr>
+          <w:p>
+            <w:pPr>
+              <w:jc w:val="center"/>
+            </w:pPr>
+            <w:r>
+              <w:rPr>
+                <w:rFonts w:ascii="Times New Roman" w:hAnsi="Times New Roman"/>
+                <w:sz w:val="20"/>
+              </w:rPr>
+              <w:t>0.2363</w:t>
+            </w:r>
+          </w:p>
+        </w:tc>
+        <w:tc>
+          <w:tcPr>
+            <w:tcW w:type="dxa" w:w="2340"/>
+          </w:tcPr>
+          <w:p>
+            <w:pPr>
+              <w:jc w:val="center"/>
+            </w:pPr>
+            <w:r>
+              <w:rPr>
+                <w:rFonts w:ascii="Times New Roman" w:hAnsi="Times New Roman"/>
+                <w:sz w:val="20"/>
+              </w:rPr>
+              <w:t>0.0045</w:t>
+            </w:r>
+          </w:p>
+        </w:tc>
+      </w:tr>
+      <w:tr>
+        <w:tc>
+          <w:tcPr>
+            <w:tcW w:type="dxa" w:w="2340"/>
+          </w:tcPr>
+          <w:p>
+            <w:pPr>
+              <w:jc w:val="center"/>
+            </w:pPr>
+            <w:r>
+              <w:rPr>
+                <w:rFonts w:ascii="Times New Roman" w:hAnsi="Times New Roman"/>
+                <w:sz w:val="20"/>
+              </w:rPr>
+              <w:t>LSA</w:t>
+            </w:r>
+          </w:p>
+        </w:tc>
+        <w:tc>
+          <w:tcPr>
+            <w:tcW w:type="dxa" w:w="2340"/>
+          </w:tcPr>
+          <w:p>
+            <w:pPr>
+              <w:jc w:val="center"/>
+            </w:pPr>
+            <w:r>
+              <w:rPr>
+                <w:rFonts w:ascii="Times New Roman" w:hAnsi="Times New Roman"/>
+                <w:sz w:val="20"/>
+              </w:rPr>
+              <w:t>3</w:t>
+            </w:r>
+          </w:p>
+        </w:tc>
+        <w:tc>
+          <w:tcPr>
+            <w:tcW w:type="dxa" w:w="2340"/>
+          </w:tcPr>
+          <w:p>
+            <w:pPr>
+              <w:jc w:val="center"/>
+            </w:pPr>
+            <w:r>
+              <w:rPr>
+                <w:rFonts w:ascii="Times New Roman" w:hAnsi="Times New Roman"/>
+                <w:sz w:val="20"/>
+              </w:rPr>
+              <w:t>0.9879</w:t>
+            </w:r>
+          </w:p>
+        </w:tc>
+        <w:tc>
+          <w:tcPr>
+            <w:tcW w:type="dxa" w:w="2340"/>
+          </w:tcPr>
+          <w:p>
+            <w:pPr>
+              <w:jc w:val="center"/>
+            </w:pPr>
+            <w:r>
+              <w:rPr>
+                <w:rFonts w:ascii="Times New Roman" w:hAnsi="Times New Roman"/>
+                <w:sz w:val="20"/>
+              </w:rPr>
+              <w:t>0.0155</w:t>
+            </w:r>
+          </w:p>
+        </w:tc>
+      </w:tr>
+      <w:tr>
+        <w:tc>
+          <w:tcPr>
+            <w:tcW w:type="dxa" w:w="2340"/>
+          </w:tcPr>
+          <w:p>
+            <w:pPr>
+              <w:jc w:val="center"/>
+            </w:pPr>
+            <w:r>
+              <w:rPr>
+                <w:rFonts w:ascii="Times New Roman" w:hAnsi="Times New Roman"/>
+                <w:sz w:val="20"/>
+              </w:rPr>
+              <w:t>PPMI+SVD</w:t>
+            </w:r>
+          </w:p>
+        </w:tc>
+        <w:tc>
+          <w:tcPr>
+            <w:tcW w:type="dxa" w:w="2340"/>
+          </w:tcPr>
+          <w:p>
+            <w:pPr>
+              <w:jc w:val="center"/>
+            </w:pPr>
+            <w:r>
+              <w:rPr>
+                <w:rFonts w:ascii="Times New Roman" w:hAnsi="Times New Roman"/>
+                <w:sz w:val="20"/>
+              </w:rPr>
+              <w:t>3</w:t>
+            </w:r>
+          </w:p>
+        </w:tc>
+        <w:tc>
+          <w:tcPr>
+            <w:tcW w:type="dxa" w:w="2340"/>
+          </w:tcPr>
+          <w:p>
+            <w:pPr>
+              <w:jc w:val="center"/>
+            </w:pPr>
+            <w:r>
+              <w:rPr>
+                <w:rFonts w:ascii="Times New Roman" w:hAnsi="Times New Roman"/>
+                <w:sz w:val="20"/>
+              </w:rPr>
+              <w:t>0.9872</w:t>
+            </w:r>
+          </w:p>
+        </w:tc>
+        <w:tc>
+          <w:tcPr>
+            <w:tcW w:type="dxa" w:w="2340"/>
+          </w:tcPr>
+          <w:p>
+            <w:pPr>
+              <w:jc w:val="center"/>
+            </w:pPr>
+            <w:r>
+              <w:rPr>
+                <w:rFonts w:ascii="Times New Roman" w:hAnsi="Times New Roman"/>
+                <w:sz w:val="20"/>
+              </w:rPr>
+              <w:t>0.0351</w:t>
+            </w:r>
+          </w:p>
+        </w:tc>
+      </w:tr>
+    </w:tbl>
+    <w:p>
+      <w:pPr>
+        <w:spacing w:after="200"/>
+      </w:pPr>
+    </w:p>
+    <w:p>
+      <w:pPr>
+        <w:spacing w:line="480" w:lineRule="auto"/>
+        <w:jc w:val="center"/>
+      </w:pPr>
+      <w:r>
+        <w:t>Tabla 1. Separación por tema medida en el notebook ejecutado en Colab. Elaboración a partir de la celda 7.</w:t>
       </w:r>
     </w:p>
     <w:p>
@@ -387,7 +769,7 @@
       <w:r>
         <w:drawing>
           <wp:inline xmlns:a="http://schemas.openxmlformats.org/drawingml/2006/main" xmlns:pic="http://schemas.openxmlformats.org/drawingml/2006/picture">
-            <wp:extent cx="5303520" cy="4739423"/>
+            <wp:extent cx="5120640" cy="4469778"/>
             <wp:docPr id="1" name="Picture 1"/>
             <wp:cNvGraphicFramePr>
               <a:graphicFrameLocks noChangeAspect="1"/>
@@ -396,7 +778,7 @@
               <a:graphicData uri="http://schemas.openxmlformats.org/drawingml/2006/picture">
                 <pic:pic>
                   <pic:nvPicPr>
-                    <pic:cNvPr id="0" name="fig1_sim_onehot.png"/>
+                    <pic:cNvPr id="0" name="colab_fig1.png"/>
                     <pic:cNvPicPr/>
                   </pic:nvPicPr>
                   <pic:blipFill>
@@ -408,7 +790,7 @@
                   <pic:spPr>
                     <a:xfrm>
                       <a:off x="0" y="0"/>
-                      <a:ext cx="5303520" cy="4739423"/>
+                      <a:ext cx="5120640" cy="4469778"/>
                     </a:xfrm>
                     <a:prstGeom prst="rect"/>
                   </pic:spPr>
@@ -429,7 +811,17 @@
           <w:i/>
           <w:sz w:val="20"/>
         </w:rPr>
-        <w:t>Figura 1. Similitud coseno con one-hot. Elaboración propia.</w:t>
+        <w:t>Figura 1. Similitud coseno TF-IDF. Salida de Google Colab (celda 8).</w:t>
+      </w:r>
+    </w:p>
+    <w:p>
+      <w:pPr>
+        <w:spacing w:line="480" w:lineRule="auto"/>
+        <w:ind w:firstLine="720"/>
+        <w:jc w:val="both"/>
+      </w:pPr>
+      <w:r>
+        <w:t>En la Figura 1 se ven tres bloques: D1–D3 (NLP, cosenos 0.17–0.19), D4–D6 (vivienda; el par D4–D5 llega a 0.40) y D7–D8 (deporte, 0.30). Entre NLP y el resto el mapa es amarillo (0.00). Es exactamente el límite de una representación léxica: si no hay tokens en común, el ángulo es 90°.</w:t>
       </w:r>
     </w:p>
     <w:p>
@@ -439,7 +831,7 @@
       <w:r>
         <w:drawing>
           <wp:inline xmlns:a="http://schemas.openxmlformats.org/drawingml/2006/main" xmlns:pic="http://schemas.openxmlformats.org/drawingml/2006/picture">
-            <wp:extent cx="5303520" cy="4729350"/>
+            <wp:extent cx="5120640" cy="4469778"/>
             <wp:docPr id="2" name="Picture 2"/>
             <wp:cNvGraphicFramePr>
               <a:graphicFrameLocks noChangeAspect="1"/>
@@ -448,7 +840,7 @@
               <a:graphicData uri="http://schemas.openxmlformats.org/drawingml/2006/picture">
                 <pic:pic>
                   <pic:nvPicPr>
-                    <pic:cNvPr id="0" name="fig2_sim_tfidf.png"/>
+                    <pic:cNvPr id="0" name="colab_fig2.png"/>
                     <pic:cNvPicPr/>
                   </pic:nvPicPr>
                   <pic:blipFill>
@@ -460,7 +852,7 @@
                   <pic:spPr>
                     <a:xfrm>
                       <a:off x="0" y="0"/>
-                      <a:ext cx="5303520" cy="4729350"/>
+                      <a:ext cx="5120640" cy="4469778"/>
                     </a:xfrm>
                     <a:prstGeom prst="rect"/>
                   </pic:spPr>
@@ -481,7 +873,17 @@
           <w:i/>
           <w:sz w:val="20"/>
         </w:rPr>
-        <w:t>Figura 2. Similitud coseno con TF-IDF. Elaboración propia.</w:t>
+        <w:t>Figura 2. Similitud coseno LSA (3 dimensiones). Salida de Google Colab (celda 8).</w:t>
+      </w:r>
+    </w:p>
+    <w:p>
+      <w:pPr>
+        <w:spacing w:line="480" w:lineRule="auto"/>
+        <w:ind w:firstLine="720"/>
+        <w:jc w:val="both"/>
+      </w:pPr>
+      <w:r>
+        <w:t>La Figura 2 es el mismo corpus en el espacio denso. Los bloques intra-tema pasan a azul oscuro (≈ 1.00) y el cruce entre temas permanece claro. D1, D2 y D3 quedan casi indistinguibles entre sí; D4, D5 y D6 forman el otro cubo; D7 y D8 el tercero. Ahí se ve el oficio del embedding: documentos que en TF-IDF apenas se rozaban ahora comparten un factor latente de tema.</w:t>
       </w:r>
     </w:p>
     <w:p>
@@ -491,7 +893,7 @@
       <w:r>
         <w:drawing>
           <wp:inline xmlns:a="http://schemas.openxmlformats.org/drawingml/2006/main" xmlns:pic="http://schemas.openxmlformats.org/drawingml/2006/picture">
-            <wp:extent cx="5303520" cy="4729350"/>
+            <wp:extent cx="5120640" cy="3538947"/>
             <wp:docPr id="3" name="Picture 3"/>
             <wp:cNvGraphicFramePr>
               <a:graphicFrameLocks noChangeAspect="1"/>
@@ -500,7 +902,7 @@
               <a:graphicData uri="http://schemas.openxmlformats.org/drawingml/2006/picture">
                 <pic:pic>
                   <pic:nvPicPr>
-                    <pic:cNvPr id="0" name="fig3_sim_lsa.png"/>
+                    <pic:cNvPr id="0" name="colab_fig3.png"/>
                     <pic:cNvPicPr/>
                   </pic:nvPicPr>
                   <pic:blipFill>
@@ -512,7 +914,7 @@
                   <pic:spPr>
                     <a:xfrm>
                       <a:off x="0" y="0"/>
-                      <a:ext cx="5303520" cy="4729350"/>
+                      <a:ext cx="5120640" cy="3538947"/>
                     </a:xfrm>
                     <a:prstGeom prst="rect"/>
                   </pic:spPr>
@@ -533,7 +935,7 @@
           <w:i/>
           <w:sz w:val="20"/>
         </w:rPr>
-        <w:t>Figura 3. Similitud coseno con embeddings LSA (3 dimensiones). Elaboración propia.</w:t>
+        <w:t>Figura 3. PCA de documentos sobre embeddings LSA. Salida de Google Colab (celda 9).</w:t>
       </w:r>
     </w:p>
     <w:p>
@@ -543,7 +945,7 @@
         <w:jc w:val="both"/>
       </w:pPr>
       <w:r>
-        <w:t>Las Figuras 4 y 5 proyectan los embeddings a 2D con PCA. Los tres colores (NLP, vivienda, deporte) forman nubes separadas. No es un t-SNE de un modelo industrial; es la evidencia, en un corpus pequeño y controlado, de que el mapeo texto → vector organizó el espacio por tema. PPMI+SVD, que parte de contexto local (ventana 2) y no de frecuencias documento-término, llega a una separación comparable: el promedio de palabras hereda la estructura de coocurrencia.</w:t>
+        <w:t>La Figura 3 proyecta esos vectores a 2D. Azul (NLP: D1–D3) se agrupa abajo a la izquierda; rojo (vivienda: D4 y D5 casi superpuestos, D6 un poco desplazado) a la derecha; verde (deporte: D7–D8) arriba. El eje X separa vivienda del resto; el eje Y separa deporte. No es un t-SNE industrial: ocho puntos, tres temas, separación legible.</w:t>
       </w:r>
     </w:p>
     <w:p>
@@ -553,7 +955,7 @@
       <w:r>
         <w:drawing>
           <wp:inline xmlns:a="http://schemas.openxmlformats.org/drawingml/2006/main" xmlns:pic="http://schemas.openxmlformats.org/drawingml/2006/picture">
-            <wp:extent cx="5303520" cy="3675167"/>
+            <wp:extent cx="5120640" cy="3533963"/>
             <wp:docPr id="4" name="Picture 4"/>
             <wp:cNvGraphicFramePr>
               <a:graphicFrameLocks noChangeAspect="1"/>
@@ -562,7 +964,7 @@
               <a:graphicData uri="http://schemas.openxmlformats.org/drawingml/2006/picture">
                 <pic:pic>
                   <pic:nvPicPr>
-                    <pic:cNvPr id="0" name="fig4_pca_lsa.png"/>
+                    <pic:cNvPr id="0" name="colab_fig4.png"/>
                     <pic:cNvPicPr/>
                   </pic:nvPicPr>
                   <pic:blipFill>
@@ -574,7 +976,7 @@
                   <pic:spPr>
                     <a:xfrm>
                       <a:off x="0" y="0"/>
-                      <a:ext cx="5303520" cy="3675167"/>
+                      <a:ext cx="5120640" cy="3533963"/>
                     </a:xfrm>
                     <a:prstGeom prst="rect"/>
                   </pic:spPr>
@@ -595,59 +997,7 @@
           <w:i/>
           <w:sz w:val="20"/>
         </w:rPr>
-        <w:t>Figura 4. PCA de documentos sobre LSA. Elaboración propia.</w:t>
-      </w:r>
-    </w:p>
-    <w:p>
-      <w:pPr>
-        <w:jc w:val="center"/>
-      </w:pPr>
-      <w:r>
-        <w:drawing>
-          <wp:inline xmlns:a="http://schemas.openxmlformats.org/drawingml/2006/main" xmlns:pic="http://schemas.openxmlformats.org/drawingml/2006/picture">
-            <wp:extent cx="5303520" cy="3678321"/>
-            <wp:docPr id="5" name="Picture 5"/>
-            <wp:cNvGraphicFramePr>
-              <a:graphicFrameLocks noChangeAspect="1"/>
-            </wp:cNvGraphicFramePr>
-            <a:graphic>
-              <a:graphicData uri="http://schemas.openxmlformats.org/drawingml/2006/picture">
-                <pic:pic>
-                  <pic:nvPicPr>
-                    <pic:cNvPr id="0" name="fig5_pca_ppmi.png"/>
-                    <pic:cNvPicPr/>
-                  </pic:nvPicPr>
-                  <pic:blipFill>
-                    <a:blip r:embed="rId13"/>
-                    <a:stretch>
-                      <a:fillRect/>
-                    </a:stretch>
-                  </pic:blipFill>
-                  <pic:spPr>
-                    <a:xfrm>
-                      <a:off x="0" y="0"/>
-                      <a:ext cx="5303520" cy="3678321"/>
-                    </a:xfrm>
-                    <a:prstGeom prst="rect"/>
-                  </pic:spPr>
-                </pic:pic>
-              </a:graphicData>
-            </a:graphic>
-          </wp:inline>
-        </w:drawing>
-      </w:r>
-    </w:p>
-    <w:p>
-      <w:pPr>
-        <w:spacing w:line="276" w:lineRule="auto" w:after="240"/>
-        <w:jc w:val="center"/>
-      </w:pPr>
-      <w:r>
-        <w:rPr>
-          <w:i/>
-          <w:sz w:val="20"/>
-        </w:rPr>
-        <w:t>Figura 5. PCA de documentos sobre la media PPMI+SVD. Elaboración propia.</w:t>
+        <w:t>Figura 4. PCA sobre la media PPMI+SVD. Salida de Google Colab (celda 9).</w:t>
       </w:r>
     </w:p>
     <w:p>
@@ -657,7 +1007,679 @@
         <w:jc w:val="both"/>
       </w:pPr>
       <w:r>
-        <w:t>La consulta de vivienda confirma el uso práctico. El ranking LSA colocó D5 (Vivienda, coseno 0.9998), D4 (Vivienda, coseno 0.9997), D6 (Vivienda, coseno 0.9656) en los tres primeros puestos. El resto del corpus queda en torno a cero. D5 y D4 empatan casi en 1 porque la consulta comparte apartamento, tres, habitaciones, parqueadero/garaje-equivalente vía el espacio latente y Bogotá. D6 no habla de parqueadero y aun así entra al bloque vivienda (0.97): eso es el insight de un embedding denso frente a un filtro booleano.</w:t>
+        <w:t>La Figura 4, construida con coocurrencia local y no con TF-IDF, reproduce las mismas tres nubes. El embedding de documento como promedio de palabras hereda la estructura de contexto: “apartamento” y “habitaciones” empujan hacia vivienda; “fútbol” y “partido” hacia deporte.</w:t>
+      </w:r>
+    </w:p>
+    <w:p>
+      <w:pPr>
+        <w:spacing w:line="480" w:lineRule="auto"/>
+        <w:ind w:firstLine="720"/>
+        <w:jc w:val="both"/>
+      </w:pPr>
+      <w:r>
+        <w:t>La Tabla 2 es el ranking de la consulta «Necesito un apartamento de tres habitaciones con parqueadero en Bogotá», proyectada con el mismo TF-IDF+SVD (celda 10). Los tres avisos de vivienda salen primero (0.9998, 0.9997 y 0.9656). El resto del corpus queda en torno a cero. D6 no menciona parqueadero y aun así entra al bloque: eso no lo haría un filtro booleano.</w:t>
+      </w:r>
+    </w:p>
+    <w:tbl>
+      <w:tblPr>
+        <w:tblStyle w:val="TableGrid"/>
+        <w:tblW w:type="auto" w:w="0"/>
+        <w:jc w:val="center"/>
+        <w:tblLook w:firstColumn="1" w:firstRow="1" w:lastColumn="0" w:lastRow="0" w:noHBand="0" w:noVBand="1" w:val="04A0"/>
+      </w:tblPr>
+      <w:tblGrid>
+        <w:gridCol w:w="2340"/>
+        <w:gridCol w:w="2340"/>
+        <w:gridCol w:w="2340"/>
+        <w:gridCol w:w="2340"/>
+      </w:tblGrid>
+      <w:tr>
+        <w:tc>
+          <w:tcPr>
+            <w:tcW w:type="dxa" w:w="2340"/>
+          </w:tcPr>
+          <w:p>
+            <w:pPr>
+              <w:jc w:val="center"/>
+            </w:pPr>
+            <w:r>
+              <w:rPr>
+                <w:rFonts w:ascii="Times New Roman" w:hAnsi="Times New Roman"/>
+                <w:b/>
+                <w:sz w:val="20"/>
+              </w:rPr>
+              <w:t>Puesto</w:t>
+            </w:r>
+          </w:p>
+        </w:tc>
+        <w:tc>
+          <w:tcPr>
+            <w:tcW w:type="dxa" w:w="2340"/>
+          </w:tcPr>
+          <w:p>
+            <w:pPr>
+              <w:jc w:val="center"/>
+            </w:pPr>
+            <w:r>
+              <w:rPr>
+                <w:rFonts w:ascii="Times New Roman" w:hAnsi="Times New Roman"/>
+                <w:b/>
+                <w:sz w:val="20"/>
+              </w:rPr>
+              <w:t>Id</w:t>
+            </w:r>
+          </w:p>
+        </w:tc>
+        <w:tc>
+          <w:tcPr>
+            <w:tcW w:type="dxa" w:w="2340"/>
+          </w:tcPr>
+          <w:p>
+            <w:pPr>
+              <w:jc w:val="center"/>
+            </w:pPr>
+            <w:r>
+              <w:rPr>
+                <w:rFonts w:ascii="Times New Roman" w:hAnsi="Times New Roman"/>
+                <w:b/>
+                <w:sz w:val="20"/>
+              </w:rPr>
+              <w:t>Tema</w:t>
+            </w:r>
+          </w:p>
+        </w:tc>
+        <w:tc>
+          <w:tcPr>
+            <w:tcW w:type="dxa" w:w="2340"/>
+          </w:tcPr>
+          <w:p>
+            <w:pPr>
+              <w:jc w:val="center"/>
+            </w:pPr>
+            <w:r>
+              <w:rPr>
+                <w:rFonts w:ascii="Times New Roman" w:hAnsi="Times New Roman"/>
+                <w:b/>
+                <w:sz w:val="20"/>
+              </w:rPr>
+              <w:t>Coseno LSA</w:t>
+            </w:r>
+          </w:p>
+        </w:tc>
+      </w:tr>
+      <w:tr>
+        <w:tc>
+          <w:tcPr>
+            <w:tcW w:type="dxa" w:w="2340"/>
+          </w:tcPr>
+          <w:p>
+            <w:pPr>
+              <w:jc w:val="center"/>
+            </w:pPr>
+            <w:r>
+              <w:rPr>
+                <w:rFonts w:ascii="Times New Roman" w:hAnsi="Times New Roman"/>
+                <w:sz w:val="20"/>
+              </w:rPr>
+              <w:t>1</w:t>
+            </w:r>
+          </w:p>
+        </w:tc>
+        <w:tc>
+          <w:tcPr>
+            <w:tcW w:type="dxa" w:w="2340"/>
+          </w:tcPr>
+          <w:p>
+            <w:pPr>
+              <w:jc w:val="center"/>
+            </w:pPr>
+            <w:r>
+              <w:rPr>
+                <w:rFonts w:ascii="Times New Roman" w:hAnsi="Times New Roman"/>
+                <w:sz w:val="20"/>
+              </w:rPr>
+              <w:t>D5</w:t>
+            </w:r>
+          </w:p>
+        </w:tc>
+        <w:tc>
+          <w:tcPr>
+            <w:tcW w:type="dxa" w:w="2340"/>
+          </w:tcPr>
+          <w:p>
+            <w:pPr>
+              <w:jc w:val="center"/>
+            </w:pPr>
+            <w:r>
+              <w:rPr>
+                <w:rFonts w:ascii="Times New Roman" w:hAnsi="Times New Roman"/>
+                <w:sz w:val="20"/>
+              </w:rPr>
+              <w:t>Vivienda</w:t>
+            </w:r>
+          </w:p>
+        </w:tc>
+        <w:tc>
+          <w:tcPr>
+            <w:tcW w:type="dxa" w:w="2340"/>
+          </w:tcPr>
+          <w:p>
+            <w:pPr>
+              <w:jc w:val="center"/>
+            </w:pPr>
+            <w:r>
+              <w:rPr>
+                <w:rFonts w:ascii="Times New Roman" w:hAnsi="Times New Roman"/>
+                <w:sz w:val="20"/>
+              </w:rPr>
+              <w:t>0.9998</w:t>
+            </w:r>
+          </w:p>
+        </w:tc>
+      </w:tr>
+      <w:tr>
+        <w:tc>
+          <w:tcPr>
+            <w:tcW w:type="dxa" w:w="2340"/>
+          </w:tcPr>
+          <w:p>
+            <w:pPr>
+              <w:jc w:val="center"/>
+            </w:pPr>
+            <w:r>
+              <w:rPr>
+                <w:rFonts w:ascii="Times New Roman" w:hAnsi="Times New Roman"/>
+                <w:sz w:val="20"/>
+              </w:rPr>
+              <w:t>2</w:t>
+            </w:r>
+          </w:p>
+        </w:tc>
+        <w:tc>
+          <w:tcPr>
+            <w:tcW w:type="dxa" w:w="2340"/>
+          </w:tcPr>
+          <w:p>
+            <w:pPr>
+              <w:jc w:val="center"/>
+            </w:pPr>
+            <w:r>
+              <w:rPr>
+                <w:rFonts w:ascii="Times New Roman" w:hAnsi="Times New Roman"/>
+                <w:sz w:val="20"/>
+              </w:rPr>
+              <w:t>D4</w:t>
+            </w:r>
+          </w:p>
+        </w:tc>
+        <w:tc>
+          <w:tcPr>
+            <w:tcW w:type="dxa" w:w="2340"/>
+          </w:tcPr>
+          <w:p>
+            <w:pPr>
+              <w:jc w:val="center"/>
+            </w:pPr>
+            <w:r>
+              <w:rPr>
+                <w:rFonts w:ascii="Times New Roman" w:hAnsi="Times New Roman"/>
+                <w:sz w:val="20"/>
+              </w:rPr>
+              <w:t>Vivienda</w:t>
+            </w:r>
+          </w:p>
+        </w:tc>
+        <w:tc>
+          <w:tcPr>
+            <w:tcW w:type="dxa" w:w="2340"/>
+          </w:tcPr>
+          <w:p>
+            <w:pPr>
+              <w:jc w:val="center"/>
+            </w:pPr>
+            <w:r>
+              <w:rPr>
+                <w:rFonts w:ascii="Times New Roman" w:hAnsi="Times New Roman"/>
+                <w:sz w:val="20"/>
+              </w:rPr>
+              <w:t>0.9997</w:t>
+            </w:r>
+          </w:p>
+        </w:tc>
+      </w:tr>
+      <w:tr>
+        <w:tc>
+          <w:tcPr>
+            <w:tcW w:type="dxa" w:w="2340"/>
+          </w:tcPr>
+          <w:p>
+            <w:pPr>
+              <w:jc w:val="center"/>
+            </w:pPr>
+            <w:r>
+              <w:rPr>
+                <w:rFonts w:ascii="Times New Roman" w:hAnsi="Times New Roman"/>
+                <w:sz w:val="20"/>
+              </w:rPr>
+              <w:t>3</w:t>
+            </w:r>
+          </w:p>
+        </w:tc>
+        <w:tc>
+          <w:tcPr>
+            <w:tcW w:type="dxa" w:w="2340"/>
+          </w:tcPr>
+          <w:p>
+            <w:pPr>
+              <w:jc w:val="center"/>
+            </w:pPr>
+            <w:r>
+              <w:rPr>
+                <w:rFonts w:ascii="Times New Roman" w:hAnsi="Times New Roman"/>
+                <w:sz w:val="20"/>
+              </w:rPr>
+              <w:t>D6</w:t>
+            </w:r>
+          </w:p>
+        </w:tc>
+        <w:tc>
+          <w:tcPr>
+            <w:tcW w:type="dxa" w:w="2340"/>
+          </w:tcPr>
+          <w:p>
+            <w:pPr>
+              <w:jc w:val="center"/>
+            </w:pPr>
+            <w:r>
+              <w:rPr>
+                <w:rFonts w:ascii="Times New Roman" w:hAnsi="Times New Roman"/>
+                <w:sz w:val="20"/>
+              </w:rPr>
+              <w:t>Vivienda</w:t>
+            </w:r>
+          </w:p>
+        </w:tc>
+        <w:tc>
+          <w:tcPr>
+            <w:tcW w:type="dxa" w:w="2340"/>
+          </w:tcPr>
+          <w:p>
+            <w:pPr>
+              <w:jc w:val="center"/>
+            </w:pPr>
+            <w:r>
+              <w:rPr>
+                <w:rFonts w:ascii="Times New Roman" w:hAnsi="Times New Roman"/>
+                <w:sz w:val="20"/>
+              </w:rPr>
+              <w:t>0.9656</w:t>
+            </w:r>
+          </w:p>
+        </w:tc>
+      </w:tr>
+      <w:tr>
+        <w:tc>
+          <w:tcPr>
+            <w:tcW w:type="dxa" w:w="2340"/>
+          </w:tcPr>
+          <w:p>
+            <w:pPr>
+              <w:jc w:val="center"/>
+            </w:pPr>
+            <w:r>
+              <w:rPr>
+                <w:rFonts w:ascii="Times New Roman" w:hAnsi="Times New Roman"/>
+                <w:sz w:val="20"/>
+              </w:rPr>
+              <w:t>4</w:t>
+            </w:r>
+          </w:p>
+        </w:tc>
+        <w:tc>
+          <w:tcPr>
+            <w:tcW w:type="dxa" w:w="2340"/>
+          </w:tcPr>
+          <w:p>
+            <w:pPr>
+              <w:jc w:val="center"/>
+            </w:pPr>
+            <w:r>
+              <w:rPr>
+                <w:rFonts w:ascii="Times New Roman" w:hAnsi="Times New Roman"/>
+                <w:sz w:val="20"/>
+              </w:rPr>
+              <w:t>D7</w:t>
+            </w:r>
+          </w:p>
+        </w:tc>
+        <w:tc>
+          <w:tcPr>
+            <w:tcW w:type="dxa" w:w="2340"/>
+          </w:tcPr>
+          <w:p>
+            <w:pPr>
+              <w:jc w:val="center"/>
+            </w:pPr>
+            <w:r>
+              <w:rPr>
+                <w:rFonts w:ascii="Times New Roman" w:hAnsi="Times New Roman"/>
+                <w:sz w:val="20"/>
+              </w:rPr>
+              <w:t>Deporte</w:t>
+            </w:r>
+          </w:p>
+        </w:tc>
+        <w:tc>
+          <w:tcPr>
+            <w:tcW w:type="dxa" w:w="2340"/>
+          </w:tcPr>
+          <w:p>
+            <w:pPr>
+              <w:jc w:val="center"/>
+            </w:pPr>
+            <w:r>
+              <w:rPr>
+                <w:rFonts w:ascii="Times New Roman" w:hAnsi="Times New Roman"/>
+                <w:sz w:val="20"/>
+              </w:rPr>
+              <w:t>0.0219</w:t>
+            </w:r>
+          </w:p>
+        </w:tc>
+      </w:tr>
+      <w:tr>
+        <w:tc>
+          <w:tcPr>
+            <w:tcW w:type="dxa" w:w="2340"/>
+          </w:tcPr>
+          <w:p>
+            <w:pPr>
+              <w:jc w:val="center"/>
+            </w:pPr>
+            <w:r>
+              <w:rPr>
+                <w:rFonts w:ascii="Times New Roman" w:hAnsi="Times New Roman"/>
+                <w:sz w:val="20"/>
+              </w:rPr>
+              <w:t>5</w:t>
+            </w:r>
+          </w:p>
+        </w:tc>
+        <w:tc>
+          <w:tcPr>
+            <w:tcW w:type="dxa" w:w="2340"/>
+          </w:tcPr>
+          <w:p>
+            <w:pPr>
+              <w:jc w:val="center"/>
+            </w:pPr>
+            <w:r>
+              <w:rPr>
+                <w:rFonts w:ascii="Times New Roman" w:hAnsi="Times New Roman"/>
+                <w:sz w:val="20"/>
+              </w:rPr>
+              <w:t>D3</w:t>
+            </w:r>
+          </w:p>
+        </w:tc>
+        <w:tc>
+          <w:tcPr>
+            <w:tcW w:type="dxa" w:w="2340"/>
+          </w:tcPr>
+          <w:p>
+            <w:pPr>
+              <w:jc w:val="center"/>
+            </w:pPr>
+            <w:r>
+              <w:rPr>
+                <w:rFonts w:ascii="Times New Roman" w:hAnsi="Times New Roman"/>
+                <w:sz w:val="20"/>
+              </w:rPr>
+              <w:t>NLP</w:t>
+            </w:r>
+          </w:p>
+        </w:tc>
+        <w:tc>
+          <w:tcPr>
+            <w:tcW w:type="dxa" w:w="2340"/>
+          </w:tcPr>
+          <w:p>
+            <w:pPr>
+              <w:jc w:val="center"/>
+            </w:pPr>
+            <w:r>
+              <w:rPr>
+                <w:rFonts w:ascii="Times New Roman" w:hAnsi="Times New Roman"/>
+                <w:sz w:val="20"/>
+              </w:rPr>
+              <w:t>0.0000</w:t>
+            </w:r>
+          </w:p>
+        </w:tc>
+      </w:tr>
+      <w:tr>
+        <w:tc>
+          <w:tcPr>
+            <w:tcW w:type="dxa" w:w="2340"/>
+          </w:tcPr>
+          <w:p>
+            <w:pPr>
+              <w:jc w:val="center"/>
+            </w:pPr>
+            <w:r>
+              <w:rPr>
+                <w:rFonts w:ascii="Times New Roman" w:hAnsi="Times New Roman"/>
+                <w:sz w:val="20"/>
+              </w:rPr>
+              <w:t>6</w:t>
+            </w:r>
+          </w:p>
+        </w:tc>
+        <w:tc>
+          <w:tcPr>
+            <w:tcW w:type="dxa" w:w="2340"/>
+          </w:tcPr>
+          <w:p>
+            <w:pPr>
+              <w:jc w:val="center"/>
+            </w:pPr>
+            <w:r>
+              <w:rPr>
+                <w:rFonts w:ascii="Times New Roman" w:hAnsi="Times New Roman"/>
+                <w:sz w:val="20"/>
+              </w:rPr>
+              <w:t>D2</w:t>
+            </w:r>
+          </w:p>
+        </w:tc>
+        <w:tc>
+          <w:tcPr>
+            <w:tcW w:type="dxa" w:w="2340"/>
+          </w:tcPr>
+          <w:p>
+            <w:pPr>
+              <w:jc w:val="center"/>
+            </w:pPr>
+            <w:r>
+              <w:rPr>
+                <w:rFonts w:ascii="Times New Roman" w:hAnsi="Times New Roman"/>
+                <w:sz w:val="20"/>
+              </w:rPr>
+              <w:t>NLP</w:t>
+            </w:r>
+          </w:p>
+        </w:tc>
+        <w:tc>
+          <w:tcPr>
+            <w:tcW w:type="dxa" w:w="2340"/>
+          </w:tcPr>
+          <w:p>
+            <w:pPr>
+              <w:jc w:val="center"/>
+            </w:pPr>
+            <w:r>
+              <w:rPr>
+                <w:rFonts w:ascii="Times New Roman" w:hAnsi="Times New Roman"/>
+                <w:sz w:val="20"/>
+              </w:rPr>
+              <w:t>0.0000</w:t>
+            </w:r>
+          </w:p>
+        </w:tc>
+      </w:tr>
+      <w:tr>
+        <w:tc>
+          <w:tcPr>
+            <w:tcW w:type="dxa" w:w="2340"/>
+          </w:tcPr>
+          <w:p>
+            <w:pPr>
+              <w:jc w:val="center"/>
+            </w:pPr>
+            <w:r>
+              <w:rPr>
+                <w:rFonts w:ascii="Times New Roman" w:hAnsi="Times New Roman"/>
+                <w:sz w:val="20"/>
+              </w:rPr>
+              <w:t>7</w:t>
+            </w:r>
+          </w:p>
+        </w:tc>
+        <w:tc>
+          <w:tcPr>
+            <w:tcW w:type="dxa" w:w="2340"/>
+          </w:tcPr>
+          <w:p>
+            <w:pPr>
+              <w:jc w:val="center"/>
+            </w:pPr>
+            <w:r>
+              <w:rPr>
+                <w:rFonts w:ascii="Times New Roman" w:hAnsi="Times New Roman"/>
+                <w:sz w:val="20"/>
+              </w:rPr>
+              <w:t>D1</w:t>
+            </w:r>
+          </w:p>
+        </w:tc>
+        <w:tc>
+          <w:tcPr>
+            <w:tcW w:type="dxa" w:w="2340"/>
+          </w:tcPr>
+          <w:p>
+            <w:pPr>
+              <w:jc w:val="center"/>
+            </w:pPr>
+            <w:r>
+              <w:rPr>
+                <w:rFonts w:ascii="Times New Roman" w:hAnsi="Times New Roman"/>
+                <w:sz w:val="20"/>
+              </w:rPr>
+              <w:t>NLP</w:t>
+            </w:r>
+          </w:p>
+        </w:tc>
+        <w:tc>
+          <w:tcPr>
+            <w:tcW w:type="dxa" w:w="2340"/>
+          </w:tcPr>
+          <w:p>
+            <w:pPr>
+              <w:jc w:val="center"/>
+            </w:pPr>
+            <w:r>
+              <w:rPr>
+                <w:rFonts w:ascii="Times New Roman" w:hAnsi="Times New Roman"/>
+                <w:sz w:val="20"/>
+              </w:rPr>
+              <w:t>0.0000</w:t>
+            </w:r>
+          </w:p>
+        </w:tc>
+      </w:tr>
+      <w:tr>
+        <w:tc>
+          <w:tcPr>
+            <w:tcW w:type="dxa" w:w="2340"/>
+          </w:tcPr>
+          <w:p>
+            <w:pPr>
+              <w:jc w:val="center"/>
+            </w:pPr>
+            <w:r>
+              <w:rPr>
+                <w:rFonts w:ascii="Times New Roman" w:hAnsi="Times New Roman"/>
+                <w:sz w:val="20"/>
+              </w:rPr>
+              <w:t>8</w:t>
+            </w:r>
+          </w:p>
+        </w:tc>
+        <w:tc>
+          <w:tcPr>
+            <w:tcW w:type="dxa" w:w="2340"/>
+          </w:tcPr>
+          <w:p>
+            <w:pPr>
+              <w:jc w:val="center"/>
+            </w:pPr>
+            <w:r>
+              <w:rPr>
+                <w:rFonts w:ascii="Times New Roman" w:hAnsi="Times New Roman"/>
+                <w:sz w:val="20"/>
+              </w:rPr>
+              <w:t>D8</w:t>
+            </w:r>
+          </w:p>
+        </w:tc>
+        <w:tc>
+          <w:tcPr>
+            <w:tcW w:type="dxa" w:w="2340"/>
+          </w:tcPr>
+          <w:p>
+            <w:pPr>
+              <w:jc w:val="center"/>
+            </w:pPr>
+            <w:r>
+              <w:rPr>
+                <w:rFonts w:ascii="Times New Roman" w:hAnsi="Times New Roman"/>
+                <w:sz w:val="20"/>
+              </w:rPr>
+              <w:t>Deporte</w:t>
+            </w:r>
+          </w:p>
+        </w:tc>
+        <w:tc>
+          <w:tcPr>
+            <w:tcW w:type="dxa" w:w="2340"/>
+          </w:tcPr>
+          <w:p>
+            <w:pPr>
+              <w:jc w:val="center"/>
+            </w:pPr>
+            <w:r>
+              <w:rPr>
+                <w:rFonts w:ascii="Times New Roman" w:hAnsi="Times New Roman"/>
+                <w:sz w:val="20"/>
+              </w:rPr>
+              <w:t>−0.0553</w:t>
+            </w:r>
+          </w:p>
+        </w:tc>
+      </w:tr>
+    </w:tbl>
+    <w:p>
+      <w:pPr>
+        <w:spacing w:after="200"/>
+      </w:pPr>
+    </w:p>
+    <w:p>
+      <w:pPr>
+        <w:spacing w:line="480" w:lineRule="auto"/>
+        <w:jc w:val="center"/>
+      </w:pPr>
+      <w:r>
+        <w:t>Tabla 2. Recuperación semántica de la consulta de vivienda. Salida de Colab, celda 10.</w:t>
       </w:r>
     </w:p>
     <w:p>
@@ -679,7 +1701,7 @@
         <w:jc w:val="both"/>
       </w:pPr>
       <w:r>
-        <w:t>Tres lecturas. Una, el cuello de botella del NLP clásico no es “pasar texto a números”, sino elegir una geometría que no colapse la semántica. Two oraciones sin solapamiento léxico son invisibles para TF-IDF y visibles para LSA si pertenecen al mismo factor. Dos, la dimensionalidad no es un lujo: 57 ejes one-hot vs 3 densos. En un corpus real el vocabulario llega a decenas de miles; los embeddings (Word2Vec 300-D, BERT 768-D) son la misma apuesta a mayor escala (Mikolov et al., 2013; Devlin et al., 2019). Tres, el laboratorio es deliberadamente pequeño. Un modelo contextual distinguiría “banco” (finanzas) de “banco” (asiento); LSA sobre ocho oraciones no. El valor académico está en dejar el pipeline transparente y medido, no en competir con un API comercial.</w:t>
+        <w:t>Tres lecturas. Una, el cuello de botella del NLP clásico no es “pasar texto a números”, sino elegir una geometría que no colapse la semántica. Dos oraciones sin solapamiento léxico son invisibles para TF-IDF y visibles para LSA si pertenecen al mismo factor. Dos, la dimensionalidad no es un lujo: 57 ejes one-hot vs 3 densos. En un corpus real el vocabulario llega a decenas de miles; los embeddings (Word2Vec 300-D, BERT 768-D) son la misma apuesta a mayor escala (Mikolov et al., 2013; Devlin et al., 2019). Tres, el laboratorio es deliberadamente pequeño. Un modelo contextual distinguiría “banco” (finanzas) de “banco” (asiento); LSA sobre ocho oraciones no. El valor académico está en dejar el pipeline transparente y medido, no en competir con un API comercial.</w:t>
       </w:r>
     </w:p>
     <w:p>

</xml_diff>